<commit_message>
Introduce new analyses and outputs for PD20 Gibbs SELECT temperature sweep
- Added `PD20_K_draws_and_rho_explainer.md` to detail the K draws problem and $\rho^*$ estimation paths, enhancing understanding of the Gibbs SELECT framework.
- Created new metadata and visualization files for the temperature sweep analysis, including `GRANDCHILD_temperature_cold_limit_2011_2021_meta.json` and `GRANDCHILD_temperature_select_sweep_2011_2021_meta.json`, to support empirical evaluations.
- Implemented new scripts for generating cold limit diagnostics and temperature sweep outputs, ensuring comprehensive analysis of player selection dynamics.
- Updated existing scripts to incorporate the new Gibbs selection rule and temperature parameters, improving the modeling framework.

These changes strengthen the analytical capabilities of the PD20 framework, providing valuable insights into player selection dynamics and supporting future presentations.
</commit_message>
<xml_diff>
--- a/3-Master_Plan/Alex_stuff/MLE_prob.docx
+++ b/3-Master_Plan/Alex_stuff/MLE_prob.docx
@@ -1307,6 +1307,310 @@
           <w:rFonts w:eastAsiaTheme="minorEastAsia"/>
         </w:rPr>
       </w:pPr>
+      <w:r>
+        <w:rPr>
+          <w:rFonts w:eastAsiaTheme="minorEastAsia"/>
+        </w:rPr>
+        <w:t>Speaking of temperature, did you mean this?:</w:t>
+      </w:r>
+    </w:p>
+    <w:p>
+      <w:pPr>
+        <w:rPr>
+          <w:rFonts w:eastAsiaTheme="minorEastAsia"/>
+        </w:rPr>
+      </w:pPr>
+      <m:oMathPara>
+        <m:oMath>
+          <m:r>
+            <w:rPr>
+              <w:rFonts w:ascii="Cambria Math" w:hAnsi="Cambria Math"/>
+            </w:rPr>
+            <m:t>P</m:t>
+          </m:r>
+          <m:d>
+            <m:dPr>
+              <m:ctrlPr>
+                <w:rPr>
+                  <w:rFonts w:ascii="Cambria Math" w:hAnsi="Cambria Math"/>
+                </w:rPr>
+              </m:ctrlPr>
+            </m:dPr>
+            <m:e>
+              <m:r>
+                <w:rPr>
+                  <w:rFonts w:ascii="Cambria Math" w:hAnsi="Cambria Math"/>
+                </w:rPr>
+                <m:t>Y=1|i</m:t>
+              </m:r>
+            </m:e>
+          </m:d>
+          <m:r>
+            <w:rPr>
+              <w:rFonts w:ascii="Cambria Math" w:hAnsi="Cambria Math"/>
+            </w:rPr>
+            <m:t xml:space="preserve"> ∝</m:t>
+          </m:r>
+          <m:f>
+            <m:fPr>
+              <m:ctrlPr>
+                <w:rPr>
+                  <w:rFonts w:ascii="Cambria Math" w:hAnsi="Cambria Math"/>
+                </w:rPr>
+              </m:ctrlPr>
+            </m:fPr>
+            <m:num>
+              <m:sSup>
+                <m:sSupPr>
+                  <m:ctrlPr>
+                    <w:rPr>
+                      <w:rFonts w:ascii="Cambria Math" w:hAnsi="Cambria Math"/>
+                    </w:rPr>
+                  </m:ctrlPr>
+                </m:sSupPr>
+                <m:e>
+                  <m:r>
+                    <w:rPr>
+                      <w:rFonts w:ascii="Cambria Math" w:hAnsi="Cambria Math"/>
+                    </w:rPr>
+                    <m:t>e</m:t>
+                  </m:r>
+                </m:e>
+                <m:sup>
+                  <m:d>
+                    <m:dPr>
+                      <m:ctrlPr>
+                        <w:rPr>
+                          <w:rFonts w:ascii="Cambria Math" w:hAnsi="Cambria Math"/>
+                        </w:rPr>
+                      </m:ctrlPr>
+                    </m:dPr>
+                    <m:e>
+                      <m:sSub>
+                        <m:sSubPr>
+                          <m:ctrlPr>
+                            <w:rPr>
+                              <w:rFonts w:ascii="Cambria Math" w:hAnsi="Cambria Math"/>
+                            </w:rPr>
+                          </m:ctrlPr>
+                        </m:sSubPr>
+                        <m:e>
+                          <m:r>
+                            <w:rPr>
+                              <w:rFonts w:ascii="Cambria Math" w:hAnsi="Cambria Math"/>
+                            </w:rPr>
+                            <m:t>A</m:t>
+                          </m:r>
+                        </m:e>
+                        <m:sub>
+                          <m:r>
+                            <w:rPr>
+                              <w:rFonts w:ascii="Cambria Math" w:hAnsi="Cambria Math"/>
+                            </w:rPr>
+                            <m:t>i</m:t>
+                          </m:r>
+                        </m:sub>
+                      </m:sSub>
+                      <m:r>
+                        <w:rPr>
+                          <w:rFonts w:ascii="Cambria Math" w:hAnsi="Cambria Math"/>
+                        </w:rPr>
+                        <m:t>-</m:t>
+                      </m:r>
+                      <m:r>
+                        <w:rPr>
+                          <w:rFonts w:ascii="Cambria Math" w:hAnsi="Cambria Math"/>
+                        </w:rPr>
+                        <m:t>λ</m:t>
+                      </m:r>
+                      <m:r>
+                        <w:rPr>
+                          <w:rFonts w:ascii="Cambria Math" w:hAnsi="Cambria Math"/>
+                        </w:rPr>
+                        <m:t>⋅</m:t>
+                      </m:r>
+                      <m:sSub>
+                        <m:sSubPr>
+                          <m:ctrlPr>
+                            <w:rPr>
+                              <w:rFonts w:ascii="Cambria Math" w:hAnsi="Cambria Math"/>
+                            </w:rPr>
+                          </m:ctrlPr>
+                        </m:sSubPr>
+                        <m:e>
+                          <m:r>
+                            <w:rPr>
+                              <w:rFonts w:ascii="Cambria Math" w:hAnsi="Cambria Math"/>
+                            </w:rPr>
+                            <m:t>L</m:t>
+                          </m:r>
+                        </m:e>
+                        <m:sub>
+                          <m:r>
+                            <w:rPr>
+                              <w:rFonts w:ascii="Cambria Math" w:hAnsi="Cambria Math"/>
+                            </w:rPr>
+                            <m:t>CJ</m:t>
+                          </m:r>
+                        </m:sub>
+                      </m:sSub>
+                    </m:e>
+                  </m:d>
+                  <m:r>
+                    <w:rPr>
+                      <w:rFonts w:ascii="Cambria Math" w:hAnsi="Cambria Math"/>
+                    </w:rPr>
+                    <m:t>/t</m:t>
+                  </m:r>
+                </m:sup>
+              </m:sSup>
+            </m:num>
+            <m:den>
+              <m:nary>
+                <m:naryPr>
+                  <m:chr m:val="∑"/>
+                  <m:limLoc m:val="subSup"/>
+                  <m:supHide m:val="1"/>
+                  <m:ctrlPr>
+                    <w:rPr>
+                      <w:rFonts w:ascii="Cambria Math" w:hAnsi="Cambria Math"/>
+                    </w:rPr>
+                  </m:ctrlPr>
+                </m:naryPr>
+                <m:sub>
+                  <m:r>
+                    <w:rPr>
+                      <w:rFonts w:ascii="Cambria Math" w:hAnsi="Cambria Math"/>
+                    </w:rPr>
+                    <m:t>i</m:t>
+                  </m:r>
+                </m:sub>
+                <m:sup/>
+                <m:e>
+                  <m:sSup>
+                    <m:sSupPr>
+                      <m:ctrlPr>
+                        <w:rPr>
+                          <w:rFonts w:ascii="Cambria Math" w:hAnsi="Cambria Math"/>
+                        </w:rPr>
+                      </m:ctrlPr>
+                    </m:sSupPr>
+                    <m:e>
+                      <m:r>
+                        <w:rPr>
+                          <w:rFonts w:ascii="Cambria Math" w:hAnsi="Cambria Math"/>
+                        </w:rPr>
+                        <m:t>e</m:t>
+                      </m:r>
+                    </m:e>
+                    <m:sup>
+                      <m:d>
+                        <m:dPr>
+                          <m:ctrlPr>
+                            <w:rPr>
+                              <w:rFonts w:ascii="Cambria Math" w:hAnsi="Cambria Math"/>
+                            </w:rPr>
+                          </m:ctrlPr>
+                        </m:dPr>
+                        <m:e>
+                          <m:sSub>
+                            <m:sSubPr>
+                              <m:ctrlPr>
+                                <w:rPr>
+                                  <w:rFonts w:ascii="Cambria Math" w:hAnsi="Cambria Math"/>
+                                </w:rPr>
+                              </m:ctrlPr>
+                            </m:sSubPr>
+                            <m:e>
+                              <m:r>
+                                <w:rPr>
+                                  <w:rFonts w:ascii="Cambria Math" w:hAnsi="Cambria Math"/>
+                                </w:rPr>
+                                <m:t>A</m:t>
+                              </m:r>
+                            </m:e>
+                            <m:sub>
+                              <m:r>
+                                <w:rPr>
+                                  <w:rFonts w:ascii="Cambria Math" w:hAnsi="Cambria Math"/>
+                                </w:rPr>
+                                <m:t>i</m:t>
+                              </m:r>
+                            </m:sub>
+                          </m:sSub>
+                          <m:r>
+                            <w:rPr>
+                              <w:rFonts w:ascii="Cambria Math" w:hAnsi="Cambria Math"/>
+                            </w:rPr>
+                            <m:t>-</m:t>
+                          </m:r>
+                          <m:r>
+                            <w:rPr>
+                              <w:rFonts w:ascii="Cambria Math" w:hAnsi="Cambria Math"/>
+                            </w:rPr>
+                            <m:t>λ</m:t>
+                          </m:r>
+                          <m:r>
+                            <w:rPr>
+                              <w:rFonts w:ascii="Cambria Math" w:hAnsi="Cambria Math"/>
+                            </w:rPr>
+                            <m:t>⋅</m:t>
+                          </m:r>
+                          <m:sSub>
+                            <m:sSubPr>
+                              <m:ctrlPr>
+                                <w:rPr>
+                                  <w:rFonts w:ascii="Cambria Math" w:hAnsi="Cambria Math"/>
+                                </w:rPr>
+                              </m:ctrlPr>
+                            </m:sSubPr>
+                            <m:e>
+                              <m:r>
+                                <w:rPr>
+                                  <w:rFonts w:ascii="Cambria Math" w:hAnsi="Cambria Math"/>
+                                </w:rPr>
+                                <m:t>L</m:t>
+                              </m:r>
+                            </m:e>
+                            <m:sub>
+                              <m:r>
+                                <w:rPr>
+                                  <w:rFonts w:ascii="Cambria Math" w:hAnsi="Cambria Math"/>
+                                </w:rPr>
+                                <m:t>CJ</m:t>
+                              </m:r>
+                            </m:sub>
+                          </m:sSub>
+                        </m:e>
+                      </m:d>
+                      <m:r>
+                        <w:rPr>
+                          <w:rFonts w:ascii="Cambria Math" w:hAnsi="Cambria Math"/>
+                        </w:rPr>
+                        <m:t>/t</m:t>
+                      </m:r>
+                    </m:sup>
+                  </m:sSup>
+                </m:e>
+              </m:nary>
+            </m:den>
+          </m:f>
+        </m:oMath>
+      </m:oMathPara>
+    </w:p>
+    <w:p>
+      <w:pPr>
+        <w:rPr>
+          <w:rFonts w:eastAsiaTheme="minorEastAsia"/>
+        </w:rPr>
+      </w:pPr>
+    </w:p>
+    <w:p>
+      <w:pPr>
+        <w:rPr>
+          <w:rFonts w:eastAsiaTheme="minorEastAsia"/>
+        </w:rPr>
+      </w:pPr>
     </w:p>
     <w:p>
       <w:pPr>
@@ -1409,6 +1713,11 @@
       </w:pPr>
     </w:p>
     <w:p>
+      <w:pPr>
+        <w:rPr>
+          <w:rFonts w:eastAsiaTheme="minorEastAsia"/>
+        </w:rPr>
+      </w:pPr>
       <w:r>
         <w:rPr>
           <w:rFonts w:eastAsiaTheme="minorEastAsia"/>
@@ -1461,6 +1770,50 @@
         <w:t xml:space="preserve"> elements don’t “break” the system.</w:t>
       </w:r>
     </w:p>
+    <w:p>
+      <w:pPr>
+        <w:rPr>
+          <w:rFonts w:eastAsiaTheme="minorEastAsia"/>
+        </w:rPr>
+      </w:pPr>
+      <w:r>
+        <w:rPr>
+          <w:rFonts w:eastAsiaTheme="minorEastAsia"/>
+        </w:rPr>
+        <w:br w:type="page"/>
+      </w:r>
+    </w:p>
+    <w:p>
+      <w:r>
+        <w:lastRenderedPageBreak/>
+        <w:t>VA Community Care number – 877-881-7618</w:t>
+      </w:r>
+    </w:p>
+    <w:p/>
+    <w:p>
+      <w:r>
+        <w:t>My existing PCM:  Catherine Romaine at Crossroads Family Medicine – 434-243-4660</w:t>
+      </w:r>
+    </w:p>
+    <w:p>
+      <w:r>
+        <w:t>New Temp PCM: Sherry Fu at Lee St - 434-924-5348</w:t>
+      </w:r>
+    </w:p>
+    <w:p>
+      <w:r>
+        <w:t xml:space="preserve">New Additional Doc: John Gazewood at Lee St </w:t>
+      </w:r>
+      <w:r>
+        <w:t>- 434-924-5348</w:t>
+      </w:r>
+    </w:p>
+    <w:p>
+      <w:r>
+        <w:t>Existing URO Cancer Doc: Nassib Abu Heidar at Lee St – 434-358-9348</w:t>
+      </w:r>
+    </w:p>
+    <w:p/>
     <w:sectPr>
       <w:pgSz w:w="12240" w:h="15840"/>
       <w:pgMar w:top="1440" w:right="1440" w:bottom="1440" w:left="1440" w:header="720" w:footer="720" w:gutter="0"/>

</xml_diff>

<commit_message>
Enhance agent communication guidelines and update statistics
- Added new rule for shorthand communication with users in `.cursor/rules/shorthand-with-user.mdc`, emphasizing the importance of spelling out terms before using shorthands.
- Updated `AGENTS.md` to include the new shorthand rule, improving clarity in agent-user interactions.
- Revised `statistics.json` to reflect updated user and agent message counts, ensuring accurate tracking of project activity.

These changes improve the communication framework for agents, fostering clearer interactions and enhancing overall project documentation.
</commit_message>
<xml_diff>
--- a/3-Master_Plan/Alex_stuff/MLE_prob.docx
+++ b/3-Master_Plan/Alex_stuff/MLE_prob.docx
@@ -661,13 +661,7 @@
                     <w:rPr>
                       <w:rFonts w:ascii="Cambria Math" w:eastAsiaTheme="minorEastAsia" w:hAnsi="Cambria Math"/>
                     </w:rPr>
-                    <m:t>1</m:t>
-                  </m:r>
-                  <m:r>
-                    <w:rPr>
-                      <w:rFonts w:ascii="Cambria Math" w:eastAsiaTheme="minorEastAsia" w:hAnsi="Cambria Math"/>
-                    </w:rPr>
-                    <m:t>+</m:t>
+                    <m:t>1+</m:t>
                   </m:r>
                   <m:sSup>
                     <m:sSupPr>
@@ -1015,12 +1009,6 @@
                   </m:r>
                 </m:e>
                 <m:sup>
-                  <m:r>
-                    <w:rPr>
-                      <w:rFonts w:ascii="Cambria Math" w:hAnsi="Cambria Math"/>
-                    </w:rPr>
-                    <m:t>t</m:t>
-                  </m:r>
                   <m:d>
                     <m:dPr>
                       <m:ctrlPr>
@@ -1059,375 +1047,7 @@
                         <w:rPr>
                           <w:rFonts w:ascii="Cambria Math" w:hAnsi="Cambria Math"/>
                         </w:rPr>
-                        <m:t>-</m:t>
-                      </m:r>
-                      <m:r>
-                        <w:rPr>
-                          <w:rFonts w:ascii="Cambria Math" w:hAnsi="Cambria Math"/>
-                        </w:rPr>
-                        <m:t>λ</m:t>
-                      </m:r>
-                      <m:r>
-                        <w:rPr>
-                          <w:rFonts w:ascii="Cambria Math" w:hAnsi="Cambria Math"/>
-                        </w:rPr>
-                        <m:t>⋅</m:t>
-                      </m:r>
-                      <m:sSub>
-                        <m:sSubPr>
-                          <m:ctrlPr>
-                            <w:rPr>
-                              <w:rFonts w:ascii="Cambria Math" w:hAnsi="Cambria Math"/>
-                            </w:rPr>
-                          </m:ctrlPr>
-                        </m:sSubPr>
-                        <m:e>
-                          <m:r>
-                            <w:rPr>
-                              <w:rFonts w:ascii="Cambria Math" w:hAnsi="Cambria Math"/>
-                            </w:rPr>
-                            <m:t>L</m:t>
-                          </m:r>
-                        </m:e>
-                        <m:sub>
-                          <m:r>
-                            <w:rPr>
-                              <w:rFonts w:ascii="Cambria Math" w:hAnsi="Cambria Math"/>
-                            </w:rPr>
-                            <m:t>CJ</m:t>
-                          </m:r>
-                        </m:sub>
-                      </m:sSub>
-                    </m:e>
-                  </m:d>
-                </m:sup>
-              </m:sSup>
-            </m:num>
-            <m:den>
-              <m:nary>
-                <m:naryPr>
-                  <m:chr m:val="∑"/>
-                  <m:limLoc m:val="subSup"/>
-                  <m:supHide m:val="1"/>
-                  <m:ctrlPr>
-                    <w:rPr>
-                      <w:rFonts w:ascii="Cambria Math" w:hAnsi="Cambria Math"/>
-                    </w:rPr>
-                  </m:ctrlPr>
-                </m:naryPr>
-                <m:sub>
-                  <m:r>
-                    <w:rPr>
-                      <w:rFonts w:ascii="Cambria Math" w:hAnsi="Cambria Math"/>
-                    </w:rPr>
-                    <m:t>i</m:t>
-                  </m:r>
-                </m:sub>
-                <m:sup/>
-                <m:e>
-                  <m:sSup>
-                    <m:sSupPr>
-                      <m:ctrlPr>
-                        <w:rPr>
-                          <w:rFonts w:ascii="Cambria Math" w:hAnsi="Cambria Math"/>
-                        </w:rPr>
-                      </m:ctrlPr>
-                    </m:sSupPr>
-                    <m:e>
-                      <m:r>
-                        <w:rPr>
-                          <w:rFonts w:ascii="Cambria Math" w:hAnsi="Cambria Math"/>
-                        </w:rPr>
-                        <m:t>e</m:t>
-                      </m:r>
-                    </m:e>
-                    <m:sup>
-                      <m:r>
-                        <w:rPr>
-                          <w:rFonts w:ascii="Cambria Math" w:hAnsi="Cambria Math"/>
-                        </w:rPr>
-                        <m:t>t</m:t>
-                      </m:r>
-                      <m:d>
-                        <m:dPr>
-                          <m:ctrlPr>
-                            <w:rPr>
-                              <w:rFonts w:ascii="Cambria Math" w:hAnsi="Cambria Math"/>
-                            </w:rPr>
-                          </m:ctrlPr>
-                        </m:dPr>
-                        <m:e>
-                          <m:sSub>
-                            <m:sSubPr>
-                              <m:ctrlPr>
-                                <w:rPr>
-                                  <w:rFonts w:ascii="Cambria Math" w:hAnsi="Cambria Math"/>
-                                </w:rPr>
-                              </m:ctrlPr>
-                            </m:sSubPr>
-                            <m:e>
-                              <m:r>
-                                <w:rPr>
-                                  <w:rFonts w:ascii="Cambria Math" w:hAnsi="Cambria Math"/>
-                                </w:rPr>
-                                <m:t>A</m:t>
-                              </m:r>
-                            </m:e>
-                            <m:sub>
-                              <m:r>
-                                <w:rPr>
-                                  <w:rFonts w:ascii="Cambria Math" w:hAnsi="Cambria Math"/>
-                                </w:rPr>
-                                <m:t>i</m:t>
-                              </m:r>
-                            </m:sub>
-                          </m:sSub>
-                          <m:r>
-                            <w:rPr>
-                              <w:rFonts w:ascii="Cambria Math" w:hAnsi="Cambria Math"/>
-                            </w:rPr>
-                            <m:t>-</m:t>
-                          </m:r>
-                          <m:r>
-                            <w:rPr>
-                              <w:rFonts w:ascii="Cambria Math" w:hAnsi="Cambria Math"/>
-                            </w:rPr>
-                            <m:t>λ</m:t>
-                          </m:r>
-                          <m:r>
-                            <w:rPr>
-                              <w:rFonts w:ascii="Cambria Math" w:hAnsi="Cambria Math"/>
-                            </w:rPr>
-                            <m:t>⋅</m:t>
-                          </m:r>
-                          <m:sSub>
-                            <m:sSubPr>
-                              <m:ctrlPr>
-                                <w:rPr>
-                                  <w:rFonts w:ascii="Cambria Math" w:hAnsi="Cambria Math"/>
-                                </w:rPr>
-                              </m:ctrlPr>
-                            </m:sSubPr>
-                            <m:e>
-                              <m:r>
-                                <w:rPr>
-                                  <w:rFonts w:ascii="Cambria Math" w:hAnsi="Cambria Math"/>
-                                </w:rPr>
-                                <m:t>L</m:t>
-                              </m:r>
-                            </m:e>
-                            <m:sub>
-                              <m:r>
-                                <w:rPr>
-                                  <w:rFonts w:ascii="Cambria Math" w:hAnsi="Cambria Math"/>
-                                </w:rPr>
-                                <m:t>CJ</m:t>
-                              </m:r>
-                            </m:sub>
-                          </m:sSub>
-                        </m:e>
-                      </m:d>
-                    </m:sup>
-                  </m:sSup>
-                </m:e>
-              </m:nary>
-            </m:den>
-          </m:f>
-        </m:oMath>
-      </m:oMathPara>
-    </w:p>
-    <w:p>
-      <w:pPr>
-        <w:rPr>
-          <w:rFonts w:eastAsiaTheme="minorEastAsia"/>
-        </w:rPr>
-      </w:pPr>
-    </w:p>
-    <w:p>
-      <w:pPr>
-        <w:ind w:left="2880" w:firstLine="720"/>
-        <w:rPr>
-          <w:rFonts w:eastAsiaTheme="minorEastAsia"/>
-        </w:rPr>
-      </w:pPr>
-      <w:r>
-        <w:rPr>
-          <w:rFonts w:eastAsiaTheme="minorEastAsia"/>
-        </w:rPr>
-        <w:t xml:space="preserve">Where </w:t>
-      </w:r>
-      <m:oMath>
-        <m:r>
-          <w:rPr>
-            <w:rFonts w:ascii="Cambria Math" w:eastAsiaTheme="minorEastAsia" w:hAnsi="Cambria Math"/>
-          </w:rPr>
-          <m:t>t</m:t>
-        </m:r>
-      </m:oMath>
-      <w:r>
-        <w:rPr>
-          <w:rFonts w:eastAsiaTheme="minorEastAsia"/>
-        </w:rPr>
-        <w:t xml:space="preserve"> is </w:t>
-      </w:r>
-      <w:r>
-        <w:rPr>
-          <w:rFonts w:eastAsiaTheme="minorEastAsia"/>
-        </w:rPr>
-        <w:t>some</w:t>
-      </w:r>
-      <w:r>
-        <w:rPr>
-          <w:rFonts w:eastAsiaTheme="minorEastAsia"/>
-        </w:rPr>
-        <w:t xml:space="preserve"> </w:t>
-      </w:r>
-      <w:r>
-        <w:rPr>
-          <w:rFonts w:eastAsiaTheme="minorEastAsia"/>
-        </w:rPr>
-        <w:t>“</w:t>
-      </w:r>
-      <w:r>
-        <w:rPr>
-          <w:rFonts w:eastAsiaTheme="minorEastAsia"/>
-        </w:rPr>
-        <w:t>temperature</w:t>
-      </w:r>
-      <w:r>
-        <w:rPr>
-          <w:rFonts w:eastAsiaTheme="minorEastAsia"/>
-        </w:rPr>
-        <w:t>”</w:t>
-      </w:r>
-    </w:p>
-    <w:p>
-      <w:pPr>
-        <w:rPr>
-          <w:rFonts w:eastAsiaTheme="minorEastAsia"/>
-        </w:rPr>
-      </w:pPr>
-      <w:r>
-        <w:rPr>
-          <w:rFonts w:eastAsiaTheme="minorEastAsia"/>
-        </w:rPr>
-        <w:t>Speaking of temperature, did you mean this?:</w:t>
-      </w:r>
-    </w:p>
-    <w:p>
-      <w:pPr>
-        <w:rPr>
-          <w:rFonts w:eastAsiaTheme="minorEastAsia"/>
-        </w:rPr>
-      </w:pPr>
-      <m:oMathPara>
-        <m:oMath>
-          <m:r>
-            <w:rPr>
-              <w:rFonts w:ascii="Cambria Math" w:hAnsi="Cambria Math"/>
-            </w:rPr>
-            <m:t>P</m:t>
-          </m:r>
-          <m:d>
-            <m:dPr>
-              <m:ctrlPr>
-                <w:rPr>
-                  <w:rFonts w:ascii="Cambria Math" w:hAnsi="Cambria Math"/>
-                </w:rPr>
-              </m:ctrlPr>
-            </m:dPr>
-            <m:e>
-              <m:r>
-                <w:rPr>
-                  <w:rFonts w:ascii="Cambria Math" w:hAnsi="Cambria Math"/>
-                </w:rPr>
-                <m:t>Y=1|i</m:t>
-              </m:r>
-            </m:e>
-          </m:d>
-          <m:r>
-            <w:rPr>
-              <w:rFonts w:ascii="Cambria Math" w:hAnsi="Cambria Math"/>
-            </w:rPr>
-            <m:t xml:space="preserve"> ∝</m:t>
-          </m:r>
-          <m:f>
-            <m:fPr>
-              <m:ctrlPr>
-                <w:rPr>
-                  <w:rFonts w:ascii="Cambria Math" w:hAnsi="Cambria Math"/>
-                </w:rPr>
-              </m:ctrlPr>
-            </m:fPr>
-            <m:num>
-              <m:sSup>
-                <m:sSupPr>
-                  <m:ctrlPr>
-                    <w:rPr>
-                      <w:rFonts w:ascii="Cambria Math" w:hAnsi="Cambria Math"/>
-                    </w:rPr>
-                  </m:ctrlPr>
-                </m:sSupPr>
-                <m:e>
-                  <m:r>
-                    <w:rPr>
-                      <w:rFonts w:ascii="Cambria Math" w:hAnsi="Cambria Math"/>
-                    </w:rPr>
-                    <m:t>e</m:t>
-                  </m:r>
-                </m:e>
-                <m:sup>
-                  <m:d>
-                    <m:dPr>
-                      <m:ctrlPr>
-                        <w:rPr>
-                          <w:rFonts w:ascii="Cambria Math" w:hAnsi="Cambria Math"/>
-                        </w:rPr>
-                      </m:ctrlPr>
-                    </m:dPr>
-                    <m:e>
-                      <m:sSub>
-                        <m:sSubPr>
-                          <m:ctrlPr>
-                            <w:rPr>
-                              <w:rFonts w:ascii="Cambria Math" w:hAnsi="Cambria Math"/>
-                            </w:rPr>
-                          </m:ctrlPr>
-                        </m:sSubPr>
-                        <m:e>
-                          <m:r>
-                            <w:rPr>
-                              <w:rFonts w:ascii="Cambria Math" w:hAnsi="Cambria Math"/>
-                            </w:rPr>
-                            <m:t>A</m:t>
-                          </m:r>
-                        </m:e>
-                        <m:sub>
-                          <m:r>
-                            <w:rPr>
-                              <w:rFonts w:ascii="Cambria Math" w:hAnsi="Cambria Math"/>
-                            </w:rPr>
-                            <m:t>i</m:t>
-                          </m:r>
-                        </m:sub>
-                      </m:sSub>
-                      <m:r>
-                        <w:rPr>
-                          <w:rFonts w:ascii="Cambria Math" w:hAnsi="Cambria Math"/>
-                        </w:rPr>
-                        <m:t>-</m:t>
-                      </m:r>
-                      <m:r>
-                        <w:rPr>
-                          <w:rFonts w:ascii="Cambria Math" w:hAnsi="Cambria Math"/>
-                        </w:rPr>
-                        <m:t>λ</m:t>
-                      </m:r>
-                      <m:r>
-                        <w:rPr>
-                          <w:rFonts w:ascii="Cambria Math" w:hAnsi="Cambria Math"/>
-                        </w:rPr>
-                        <m:t>⋅</m:t>
+                        <m:t>-λ⋅</m:t>
                       </m:r>
                       <m:sSub>
                         <m:sSubPr>
@@ -1542,19 +1162,7 @@
                             <w:rPr>
                               <w:rFonts w:ascii="Cambria Math" w:hAnsi="Cambria Math"/>
                             </w:rPr>
-                            <m:t>-</m:t>
-                          </m:r>
-                          <m:r>
-                            <w:rPr>
-                              <w:rFonts w:ascii="Cambria Math" w:hAnsi="Cambria Math"/>
-                            </w:rPr>
-                            <m:t>λ</m:t>
-                          </m:r>
-                          <m:r>
-                            <w:rPr>
-                              <w:rFonts w:ascii="Cambria Math" w:hAnsi="Cambria Math"/>
-                            </w:rPr>
-                            <m:t>⋅</m:t>
+                            <m:t>-λ⋅</m:t>
                           </m:r>
                           <m:sSub>
                             <m:sSubPr>
@@ -1622,6 +1230,804 @@
         <w:rPr>
           <w:rFonts w:eastAsiaTheme="minorEastAsia"/>
         </w:rPr>
+        <w:t>But now we will do an algebraic transformation  of</w:t>
+      </w:r>
+      <w:r>
+        <w:rPr>
+          <w:rFonts w:eastAsiaTheme="minorEastAsia"/>
+        </w:rPr>
+        <w:t xml:space="preserve"> the numerator, </w:t>
+      </w:r>
+      <w:r>
+        <w:rPr>
+          <w:rFonts w:eastAsiaTheme="minorEastAsia"/>
+        </w:rPr>
+        <w:t xml:space="preserve"> </w:t>
+      </w:r>
+      <m:oMath>
+        <m:sSup>
+          <m:sSupPr>
+            <m:ctrlPr>
+              <w:rPr>
+                <w:rFonts w:ascii="Cambria Math" w:hAnsi="Cambria Math"/>
+              </w:rPr>
+            </m:ctrlPr>
+          </m:sSupPr>
+          <m:e>
+            <m:r>
+              <w:rPr>
+                <w:rFonts w:ascii="Cambria Math" w:hAnsi="Cambria Math"/>
+              </w:rPr>
+              <m:t>e</m:t>
+            </m:r>
+          </m:e>
+          <m:sup>
+            <m:d>
+              <m:dPr>
+                <m:ctrlPr>
+                  <w:rPr>
+                    <w:rFonts w:ascii="Cambria Math" w:hAnsi="Cambria Math"/>
+                  </w:rPr>
+                </m:ctrlPr>
+              </m:dPr>
+              <m:e>
+                <m:sSub>
+                  <m:sSubPr>
+                    <m:ctrlPr>
+                      <w:rPr>
+                        <w:rFonts w:ascii="Cambria Math" w:hAnsi="Cambria Math"/>
+                      </w:rPr>
+                    </m:ctrlPr>
+                  </m:sSubPr>
+                  <m:e>
+                    <m:r>
+                      <w:rPr>
+                        <w:rFonts w:ascii="Cambria Math" w:hAnsi="Cambria Math"/>
+                      </w:rPr>
+                      <m:t>A</m:t>
+                    </m:r>
+                  </m:e>
+                  <m:sub>
+                    <m:r>
+                      <w:rPr>
+                        <w:rFonts w:ascii="Cambria Math" w:hAnsi="Cambria Math"/>
+                      </w:rPr>
+                      <m:t>i</m:t>
+                    </m:r>
+                  </m:sub>
+                </m:sSub>
+                <m:r>
+                  <w:rPr>
+                    <w:rFonts w:ascii="Cambria Math" w:hAnsi="Cambria Math"/>
+                  </w:rPr>
+                  <m:t>-λ⋅</m:t>
+                </m:r>
+                <m:sSub>
+                  <m:sSubPr>
+                    <m:ctrlPr>
+                      <w:rPr>
+                        <w:rFonts w:ascii="Cambria Math" w:hAnsi="Cambria Math"/>
+                      </w:rPr>
+                    </m:ctrlPr>
+                  </m:sSubPr>
+                  <m:e>
+                    <m:r>
+                      <w:rPr>
+                        <w:rFonts w:ascii="Cambria Math" w:hAnsi="Cambria Math"/>
+                      </w:rPr>
+                      <m:t>L</m:t>
+                    </m:r>
+                  </m:e>
+                  <m:sub>
+                    <m:r>
+                      <w:rPr>
+                        <w:rFonts w:ascii="Cambria Math" w:hAnsi="Cambria Math"/>
+                      </w:rPr>
+                      <m:t>CJ</m:t>
+                    </m:r>
+                  </m:sub>
+                </m:sSub>
+              </m:e>
+            </m:d>
+            <m:r>
+              <w:rPr>
+                <w:rFonts w:ascii="Cambria Math" w:hAnsi="Cambria Math"/>
+              </w:rPr>
+              <m:t>/t</m:t>
+            </m:r>
+          </m:sup>
+        </m:sSup>
+      </m:oMath>
+      <w:r>
+        <w:rPr>
+          <w:rFonts w:eastAsiaTheme="minorEastAsia"/>
+        </w:rPr>
+        <w:t xml:space="preserve"> </w:t>
+      </w:r>
+      <w:r>
+        <w:rPr>
+          <w:rFonts w:eastAsiaTheme="minorEastAsia"/>
+        </w:rPr>
+        <w:t xml:space="preserve"> </w:t>
+      </w:r>
+      <w:r>
+        <w:rPr>
+          <w:rFonts w:eastAsiaTheme="minorEastAsia"/>
+        </w:rPr>
+        <w:t>t</w:t>
+      </w:r>
+      <w:r>
+        <w:rPr>
+          <w:rFonts w:eastAsiaTheme="minorEastAsia"/>
+        </w:rPr>
+        <w:t>o make it easier for the MLE.</w:t>
+      </w:r>
+    </w:p>
+    <w:p>
+      <w:pPr>
+        <w:rPr>
+          <w:rFonts w:eastAsiaTheme="minorEastAsia"/>
+        </w:rPr>
+      </w:pPr>
+      <w:r>
+        <w:rPr>
+          <w:rFonts w:eastAsiaTheme="minorEastAsia"/>
+        </w:rPr>
+        <w:t xml:space="preserve">We transform </w:t>
+      </w:r>
+      <m:oMath>
+        <m:sSup>
+          <m:sSupPr>
+            <m:ctrlPr>
+              <w:rPr>
+                <w:rFonts w:ascii="Cambria Math" w:hAnsi="Cambria Math"/>
+              </w:rPr>
+            </m:ctrlPr>
+          </m:sSupPr>
+          <m:e>
+            <m:r>
+              <w:rPr>
+                <w:rFonts w:ascii="Cambria Math" w:hAnsi="Cambria Math"/>
+              </w:rPr>
+              <m:t>e</m:t>
+            </m:r>
+          </m:e>
+          <m:sup>
+            <m:d>
+              <m:dPr>
+                <m:ctrlPr>
+                  <w:rPr>
+                    <w:rFonts w:ascii="Cambria Math" w:hAnsi="Cambria Math"/>
+                  </w:rPr>
+                </m:ctrlPr>
+              </m:dPr>
+              <m:e>
+                <m:sSub>
+                  <m:sSubPr>
+                    <m:ctrlPr>
+                      <w:rPr>
+                        <w:rFonts w:ascii="Cambria Math" w:hAnsi="Cambria Math"/>
+                      </w:rPr>
+                    </m:ctrlPr>
+                  </m:sSubPr>
+                  <m:e>
+                    <m:r>
+                      <w:rPr>
+                        <w:rFonts w:ascii="Cambria Math" w:hAnsi="Cambria Math"/>
+                      </w:rPr>
+                      <m:t>A</m:t>
+                    </m:r>
+                  </m:e>
+                  <m:sub>
+                    <m:r>
+                      <w:rPr>
+                        <w:rFonts w:ascii="Cambria Math" w:hAnsi="Cambria Math"/>
+                      </w:rPr>
+                      <m:t>i</m:t>
+                    </m:r>
+                  </m:sub>
+                </m:sSub>
+                <m:r>
+                  <w:rPr>
+                    <w:rFonts w:ascii="Cambria Math" w:hAnsi="Cambria Math"/>
+                  </w:rPr>
+                  <m:t>-λ⋅</m:t>
+                </m:r>
+                <m:sSub>
+                  <m:sSubPr>
+                    <m:ctrlPr>
+                      <w:rPr>
+                        <w:rFonts w:ascii="Cambria Math" w:hAnsi="Cambria Math"/>
+                      </w:rPr>
+                    </m:ctrlPr>
+                  </m:sSubPr>
+                  <m:e>
+                    <m:r>
+                      <w:rPr>
+                        <w:rFonts w:ascii="Cambria Math" w:hAnsi="Cambria Math"/>
+                      </w:rPr>
+                      <m:t>L</m:t>
+                    </m:r>
+                  </m:e>
+                  <m:sub>
+                    <m:r>
+                      <w:rPr>
+                        <w:rFonts w:ascii="Cambria Math" w:hAnsi="Cambria Math"/>
+                      </w:rPr>
+                      <m:t>CJ</m:t>
+                    </m:r>
+                  </m:sub>
+                </m:sSub>
+              </m:e>
+            </m:d>
+            <m:r>
+              <w:rPr>
+                <w:rFonts w:ascii="Cambria Math" w:hAnsi="Cambria Math"/>
+              </w:rPr>
+              <m:t>/t</m:t>
+            </m:r>
+          </m:sup>
+        </m:sSup>
+      </m:oMath>
+      <w:r>
+        <w:rPr>
+          <w:rFonts w:eastAsiaTheme="minorEastAsia"/>
+        </w:rPr>
+        <w:t xml:space="preserve">    to   </w:t>
+      </w:r>
+      <m:oMath>
+        <m:sSup>
+          <m:sSupPr>
+            <m:ctrlPr>
+              <w:rPr>
+                <w:rFonts w:ascii="Cambria Math" w:eastAsiaTheme="minorEastAsia" w:hAnsi="Cambria Math"/>
+              </w:rPr>
+            </m:ctrlPr>
+          </m:sSupPr>
+          <m:e>
+            <m:r>
+              <w:rPr>
+                <w:rFonts w:ascii="Cambria Math" w:eastAsiaTheme="minorEastAsia" w:hAnsi="Cambria Math"/>
+              </w:rPr>
+              <m:t>e</m:t>
+            </m:r>
+          </m:e>
+          <m:sup>
+            <m:d>
+              <m:dPr>
+                <m:ctrlPr>
+                  <w:rPr>
+                    <w:rFonts w:ascii="Cambria Math" w:eastAsiaTheme="minorEastAsia" w:hAnsi="Cambria Math"/>
+                  </w:rPr>
+                </m:ctrlPr>
+              </m:dPr>
+              <m:e>
+                <m:sSub>
+                  <m:sSubPr>
+                    <m:ctrlPr>
+                      <w:rPr>
+                        <w:rFonts w:ascii="Cambria Math" w:eastAsiaTheme="minorEastAsia" w:hAnsi="Cambria Math"/>
+                      </w:rPr>
+                    </m:ctrlPr>
+                  </m:sSubPr>
+                  <m:e>
+                    <m:r>
+                      <w:rPr>
+                        <w:rFonts w:ascii="Cambria Math" w:eastAsiaTheme="minorEastAsia" w:hAnsi="Cambria Math"/>
+                      </w:rPr>
+                      <m:t>A</m:t>
+                    </m:r>
+                  </m:e>
+                  <m:sub>
+                    <m:r>
+                      <w:rPr>
+                        <w:rFonts w:ascii="Cambria Math" w:eastAsiaTheme="minorEastAsia" w:hAnsi="Cambria Math"/>
+                      </w:rPr>
+                      <m:t>i</m:t>
+                    </m:r>
+                  </m:sub>
+                </m:sSub>
+                <m:r>
+                  <w:rPr>
+                    <w:rFonts w:ascii="Cambria Math" w:eastAsiaTheme="minorEastAsia" w:hAnsi="Cambria Math"/>
+                  </w:rPr>
+                  <m:t>/t</m:t>
+                </m:r>
+              </m:e>
+            </m:d>
+          </m:sup>
+        </m:sSup>
+        <m:r>
+          <w:rPr>
+            <w:rFonts w:ascii="Cambria Math" w:eastAsiaTheme="minorEastAsia" w:hAnsi="Cambria Math"/>
+          </w:rPr>
+          <m:t>⋅</m:t>
+        </m:r>
+        <m:sSup>
+          <m:sSupPr>
+            <m:ctrlPr>
+              <w:rPr>
+                <w:rFonts w:ascii="Cambria Math" w:eastAsiaTheme="minorEastAsia" w:hAnsi="Cambria Math"/>
+              </w:rPr>
+            </m:ctrlPr>
+          </m:sSupPr>
+          <m:e>
+            <m:r>
+              <w:rPr>
+                <w:rFonts w:ascii="Cambria Math" w:eastAsiaTheme="minorEastAsia" w:hAnsi="Cambria Math"/>
+              </w:rPr>
+              <m:t>e</m:t>
+            </m:r>
+          </m:e>
+          <m:sup>
+            <m:d>
+              <m:dPr>
+                <m:ctrlPr>
+                  <w:rPr>
+                    <w:rFonts w:ascii="Cambria Math" w:eastAsiaTheme="minorEastAsia" w:hAnsi="Cambria Math"/>
+                  </w:rPr>
+                </m:ctrlPr>
+              </m:dPr>
+              <m:e>
+                <m:r>
+                  <w:rPr>
+                    <w:rFonts w:ascii="Cambria Math" w:eastAsiaTheme="minorEastAsia" w:hAnsi="Cambria Math"/>
+                  </w:rPr>
+                  <m:t>-λ⋅</m:t>
+                </m:r>
+                <m:sSubSup>
+                  <m:sSubSupPr>
+                    <m:ctrlPr>
+                      <w:rPr>
+                        <w:rFonts w:ascii="Cambria Math" w:eastAsiaTheme="minorEastAsia" w:hAnsi="Cambria Math"/>
+                      </w:rPr>
+                    </m:ctrlPr>
+                  </m:sSubSupPr>
+                  <m:e>
+                    <m:r>
+                      <w:rPr>
+                        <w:rFonts w:ascii="Cambria Math" w:eastAsiaTheme="minorEastAsia" w:hAnsi="Cambria Math"/>
+                      </w:rPr>
+                      <m:t>L</m:t>
+                    </m:r>
+                  </m:e>
+                  <m:sub>
+                    <m:r>
+                      <w:rPr>
+                        <w:rFonts w:ascii="Cambria Math" w:eastAsiaTheme="minorEastAsia" w:hAnsi="Cambria Math"/>
+                      </w:rPr>
+                      <m:t>j</m:t>
+                    </m:r>
+                  </m:sub>
+                  <m:sup>
+                    <m:r>
+                      <w:rPr>
+                        <w:rFonts w:ascii="Cambria Math" w:eastAsiaTheme="minorEastAsia" w:hAnsi="Cambria Math"/>
+                      </w:rPr>
+                      <m:t>C</m:t>
+                    </m:r>
+                  </m:sup>
+                </m:sSubSup>
+              </m:e>
+            </m:d>
+          </m:sup>
+        </m:sSup>
+      </m:oMath>
+      <w:r>
+        <w:rPr>
+          <w:rFonts w:eastAsiaTheme="minorEastAsia"/>
+        </w:rPr>
+        <w:t xml:space="preserve"> where </w:t>
+      </w:r>
+      <m:oMath>
+        <m:r>
+          <w:rPr>
+            <w:rFonts w:ascii="Cambria Math" w:eastAsiaTheme="minorEastAsia" w:hAnsi="Cambria Math"/>
+          </w:rPr>
+          <m:t>λ</m:t>
+        </m:r>
+      </m:oMath>
+      <w:r>
+        <w:rPr>
+          <w:rFonts w:eastAsiaTheme="minorEastAsia"/>
+        </w:rPr>
+        <w:t xml:space="preserve"> absorbs part of </w:t>
+      </w:r>
+      <m:oMath>
+        <m:r>
+          <w:rPr>
+            <w:rFonts w:ascii="Cambria Math" w:eastAsiaTheme="minorEastAsia" w:hAnsi="Cambria Math"/>
+          </w:rPr>
+          <m:t>t</m:t>
+        </m:r>
+      </m:oMath>
+      <w:r>
+        <w:rPr>
+          <w:rFonts w:eastAsiaTheme="minorEastAsia"/>
+        </w:rPr>
+        <w:t xml:space="preserve"> as a constant and so now we have :</w:t>
+      </w:r>
+    </w:p>
+    <w:p>
+      <w:pPr>
+        <w:rPr>
+          <w:rFonts w:eastAsiaTheme="minorEastAsia"/>
+        </w:rPr>
+      </w:pPr>
+      <m:oMathPara>
+        <m:oMath>
+          <m:r>
+            <w:rPr>
+              <w:rFonts w:ascii="Cambria Math" w:hAnsi="Cambria Math"/>
+            </w:rPr>
+            <m:t>P</m:t>
+          </m:r>
+          <m:d>
+            <m:dPr>
+              <m:ctrlPr>
+                <w:rPr>
+                  <w:rFonts w:ascii="Cambria Math" w:hAnsi="Cambria Math"/>
+                </w:rPr>
+              </m:ctrlPr>
+            </m:dPr>
+            <m:e>
+              <m:r>
+                <w:rPr>
+                  <w:rFonts w:ascii="Cambria Math" w:hAnsi="Cambria Math"/>
+                </w:rPr>
+                <m:t>Y=1|i</m:t>
+              </m:r>
+            </m:e>
+          </m:d>
+          <m:r>
+            <w:rPr>
+              <w:rFonts w:ascii="Cambria Math" w:hAnsi="Cambria Math"/>
+            </w:rPr>
+            <m:t xml:space="preserve"> ∝</m:t>
+          </m:r>
+          <m:f>
+            <m:fPr>
+              <m:ctrlPr>
+                <w:rPr>
+                  <w:rFonts w:ascii="Cambria Math" w:hAnsi="Cambria Math"/>
+                </w:rPr>
+              </m:ctrlPr>
+            </m:fPr>
+            <m:num>
+              <m:sSup>
+                <m:sSupPr>
+                  <m:ctrlPr>
+                    <w:rPr>
+                      <w:rFonts w:ascii="Cambria Math" w:eastAsiaTheme="minorEastAsia" w:hAnsi="Cambria Math"/>
+                    </w:rPr>
+                  </m:ctrlPr>
+                </m:sSupPr>
+                <m:e>
+                  <m:r>
+                    <w:rPr>
+                      <w:rFonts w:ascii="Cambria Math" w:eastAsiaTheme="minorEastAsia" w:hAnsi="Cambria Math"/>
+                    </w:rPr>
+                    <m:t>e</m:t>
+                  </m:r>
+                </m:e>
+                <m:sup>
+                  <m:d>
+                    <m:dPr>
+                      <m:ctrlPr>
+                        <w:rPr>
+                          <w:rFonts w:ascii="Cambria Math" w:eastAsiaTheme="minorEastAsia" w:hAnsi="Cambria Math"/>
+                        </w:rPr>
+                      </m:ctrlPr>
+                    </m:dPr>
+                    <m:e>
+                      <m:sSub>
+                        <m:sSubPr>
+                          <m:ctrlPr>
+                            <w:rPr>
+                              <w:rFonts w:ascii="Cambria Math" w:eastAsiaTheme="minorEastAsia" w:hAnsi="Cambria Math"/>
+                            </w:rPr>
+                          </m:ctrlPr>
+                        </m:sSubPr>
+                        <m:e>
+                          <m:r>
+                            <w:rPr>
+                              <w:rFonts w:ascii="Cambria Math" w:eastAsiaTheme="minorEastAsia" w:hAnsi="Cambria Math"/>
+                            </w:rPr>
+                            <m:t>A</m:t>
+                          </m:r>
+                        </m:e>
+                        <m:sub>
+                          <m:r>
+                            <w:rPr>
+                              <w:rFonts w:ascii="Cambria Math" w:eastAsiaTheme="minorEastAsia" w:hAnsi="Cambria Math"/>
+                            </w:rPr>
+                            <m:t>i</m:t>
+                          </m:r>
+                        </m:sub>
+                      </m:sSub>
+                      <m:r>
+                        <w:rPr>
+                          <w:rFonts w:ascii="Cambria Math" w:eastAsiaTheme="minorEastAsia" w:hAnsi="Cambria Math"/>
+                        </w:rPr>
+                        <m:t>/t</m:t>
+                      </m:r>
+                    </m:e>
+                  </m:d>
+                </m:sup>
+              </m:sSup>
+              <m:r>
+                <w:rPr>
+                  <w:rFonts w:ascii="Cambria Math" w:eastAsiaTheme="minorEastAsia" w:hAnsi="Cambria Math"/>
+                </w:rPr>
+                <m:t>⋅</m:t>
+              </m:r>
+              <m:sSup>
+                <m:sSupPr>
+                  <m:ctrlPr>
+                    <w:rPr>
+                      <w:rFonts w:ascii="Cambria Math" w:eastAsiaTheme="minorEastAsia" w:hAnsi="Cambria Math"/>
+                    </w:rPr>
+                  </m:ctrlPr>
+                </m:sSupPr>
+                <m:e>
+                  <m:r>
+                    <w:rPr>
+                      <w:rFonts w:ascii="Cambria Math" w:eastAsiaTheme="minorEastAsia" w:hAnsi="Cambria Math"/>
+                    </w:rPr>
+                    <m:t>e</m:t>
+                  </m:r>
+                </m:e>
+                <m:sup>
+                  <m:d>
+                    <m:dPr>
+                      <m:ctrlPr>
+                        <w:rPr>
+                          <w:rFonts w:ascii="Cambria Math" w:eastAsiaTheme="minorEastAsia" w:hAnsi="Cambria Math"/>
+                        </w:rPr>
+                      </m:ctrlPr>
+                    </m:dPr>
+                    <m:e>
+                      <m:r>
+                        <w:rPr>
+                          <w:rFonts w:ascii="Cambria Math" w:eastAsiaTheme="minorEastAsia" w:hAnsi="Cambria Math"/>
+                        </w:rPr>
+                        <m:t>-λ⋅</m:t>
+                      </m:r>
+                      <m:sSubSup>
+                        <m:sSubSupPr>
+                          <m:ctrlPr>
+                            <w:rPr>
+                              <w:rFonts w:ascii="Cambria Math" w:eastAsiaTheme="minorEastAsia" w:hAnsi="Cambria Math"/>
+                            </w:rPr>
+                          </m:ctrlPr>
+                        </m:sSubSupPr>
+                        <m:e>
+                          <m:r>
+                            <w:rPr>
+                              <w:rFonts w:ascii="Cambria Math" w:eastAsiaTheme="minorEastAsia" w:hAnsi="Cambria Math"/>
+                            </w:rPr>
+                            <m:t>L</m:t>
+                          </m:r>
+                        </m:e>
+                        <m:sub>
+                          <m:r>
+                            <w:rPr>
+                              <w:rFonts w:ascii="Cambria Math" w:eastAsiaTheme="minorEastAsia" w:hAnsi="Cambria Math"/>
+                            </w:rPr>
+                            <m:t>j</m:t>
+                          </m:r>
+                        </m:sub>
+                        <m:sup>
+                          <m:r>
+                            <w:rPr>
+                              <w:rFonts w:ascii="Cambria Math" w:eastAsiaTheme="minorEastAsia" w:hAnsi="Cambria Math"/>
+                            </w:rPr>
+                            <m:t>C</m:t>
+                          </m:r>
+                        </m:sup>
+                      </m:sSubSup>
+                    </m:e>
+                  </m:d>
+                </m:sup>
+              </m:sSup>
+            </m:num>
+            <m:den>
+              <m:nary>
+                <m:naryPr>
+                  <m:chr m:val="∑"/>
+                  <m:limLoc m:val="subSup"/>
+                  <m:supHide m:val="1"/>
+                  <m:ctrlPr>
+                    <w:rPr>
+                      <w:rFonts w:ascii="Cambria Math" w:hAnsi="Cambria Math"/>
+                    </w:rPr>
+                  </m:ctrlPr>
+                </m:naryPr>
+                <m:sub>
+                  <m:r>
+                    <w:rPr>
+                      <w:rFonts w:ascii="Cambria Math" w:hAnsi="Cambria Math"/>
+                    </w:rPr>
+                    <m:t>i</m:t>
+                  </m:r>
+                </m:sub>
+                <m:sup/>
+                <m:e>
+                  <m:sSup>
+                    <m:sSupPr>
+                      <m:ctrlPr>
+                        <w:rPr>
+                          <w:rFonts w:ascii="Cambria Math" w:eastAsiaTheme="minorEastAsia" w:hAnsi="Cambria Math"/>
+                        </w:rPr>
+                      </m:ctrlPr>
+                    </m:sSupPr>
+                    <m:e>
+                      <m:r>
+                        <w:rPr>
+                          <w:rFonts w:ascii="Cambria Math" w:eastAsiaTheme="minorEastAsia" w:hAnsi="Cambria Math"/>
+                        </w:rPr>
+                        <m:t>e</m:t>
+                      </m:r>
+                    </m:e>
+                    <m:sup>
+                      <m:d>
+                        <m:dPr>
+                          <m:ctrlPr>
+                            <w:rPr>
+                              <w:rFonts w:ascii="Cambria Math" w:eastAsiaTheme="minorEastAsia" w:hAnsi="Cambria Math"/>
+                            </w:rPr>
+                          </m:ctrlPr>
+                        </m:dPr>
+                        <m:e>
+                          <m:sSub>
+                            <m:sSubPr>
+                              <m:ctrlPr>
+                                <w:rPr>
+                                  <w:rFonts w:ascii="Cambria Math" w:eastAsiaTheme="minorEastAsia" w:hAnsi="Cambria Math"/>
+                                </w:rPr>
+                              </m:ctrlPr>
+                            </m:sSubPr>
+                            <m:e>
+                              <m:r>
+                                <w:rPr>
+                                  <w:rFonts w:ascii="Cambria Math" w:eastAsiaTheme="minorEastAsia" w:hAnsi="Cambria Math"/>
+                                </w:rPr>
+                                <m:t>A</m:t>
+                              </m:r>
+                            </m:e>
+                            <m:sub>
+                              <m:r>
+                                <w:rPr>
+                                  <w:rFonts w:ascii="Cambria Math" w:eastAsiaTheme="minorEastAsia" w:hAnsi="Cambria Math"/>
+                                </w:rPr>
+                                <m:t>i</m:t>
+                              </m:r>
+                            </m:sub>
+                          </m:sSub>
+                          <m:r>
+                            <w:rPr>
+                              <w:rFonts w:ascii="Cambria Math" w:eastAsiaTheme="minorEastAsia" w:hAnsi="Cambria Math"/>
+                            </w:rPr>
+                            <m:t>/t</m:t>
+                          </m:r>
+                        </m:e>
+                      </m:d>
+                    </m:sup>
+                  </m:sSup>
+                  <m:r>
+                    <w:rPr>
+                      <w:rFonts w:ascii="Cambria Math" w:eastAsiaTheme="minorEastAsia" w:hAnsi="Cambria Math"/>
+                    </w:rPr>
+                    <m:t>⋅</m:t>
+                  </m:r>
+                  <m:sSup>
+                    <m:sSupPr>
+                      <m:ctrlPr>
+                        <w:rPr>
+                          <w:rFonts w:ascii="Cambria Math" w:eastAsiaTheme="minorEastAsia" w:hAnsi="Cambria Math"/>
+                        </w:rPr>
+                      </m:ctrlPr>
+                    </m:sSupPr>
+                    <m:e>
+                      <m:r>
+                        <w:rPr>
+                          <w:rFonts w:ascii="Cambria Math" w:eastAsiaTheme="minorEastAsia" w:hAnsi="Cambria Math"/>
+                        </w:rPr>
+                        <m:t>e</m:t>
+                      </m:r>
+                    </m:e>
+                    <m:sup>
+                      <m:d>
+                        <m:dPr>
+                          <m:ctrlPr>
+                            <w:rPr>
+                              <w:rFonts w:ascii="Cambria Math" w:eastAsiaTheme="minorEastAsia" w:hAnsi="Cambria Math"/>
+                            </w:rPr>
+                          </m:ctrlPr>
+                        </m:dPr>
+                        <m:e>
+                          <m:r>
+                            <w:rPr>
+                              <w:rFonts w:ascii="Cambria Math" w:eastAsiaTheme="minorEastAsia" w:hAnsi="Cambria Math"/>
+                            </w:rPr>
+                            <m:t>-λ⋅</m:t>
+                          </m:r>
+                          <m:sSubSup>
+                            <m:sSubSupPr>
+                              <m:ctrlPr>
+                                <w:rPr>
+                                  <w:rFonts w:ascii="Cambria Math" w:eastAsiaTheme="minorEastAsia" w:hAnsi="Cambria Math"/>
+                                </w:rPr>
+                              </m:ctrlPr>
+                            </m:sSubSupPr>
+                            <m:e>
+                              <m:r>
+                                <w:rPr>
+                                  <w:rFonts w:ascii="Cambria Math" w:eastAsiaTheme="minorEastAsia" w:hAnsi="Cambria Math"/>
+                                </w:rPr>
+                                <m:t>L</m:t>
+                              </m:r>
+                            </m:e>
+                            <m:sub>
+                              <m:r>
+                                <w:rPr>
+                                  <w:rFonts w:ascii="Cambria Math" w:eastAsiaTheme="minorEastAsia" w:hAnsi="Cambria Math"/>
+                                </w:rPr>
+                                <m:t>j</m:t>
+                              </m:r>
+                            </m:sub>
+                            <m:sup>
+                              <m:r>
+                                <w:rPr>
+                                  <w:rFonts w:ascii="Cambria Math" w:eastAsiaTheme="minorEastAsia" w:hAnsi="Cambria Math"/>
+                                </w:rPr>
+                                <m:t>C</m:t>
+                              </m:r>
+                            </m:sup>
+                          </m:sSubSup>
+                        </m:e>
+                      </m:d>
+                    </m:sup>
+                  </m:sSup>
+                </m:e>
+              </m:nary>
+            </m:den>
+          </m:f>
+        </m:oMath>
+      </m:oMathPara>
+    </w:p>
+    <w:p>
+      <w:pPr>
+        <w:rPr>
+          <w:rFonts w:eastAsiaTheme="minorEastAsia"/>
+        </w:rPr>
+      </w:pPr>
+    </w:p>
+    <w:p>
+      <w:pPr>
+        <w:rPr>
+          <w:rFonts w:eastAsiaTheme="minorEastAsia"/>
+        </w:rPr>
+      </w:pPr>
+    </w:p>
+    <w:p>
+      <w:pPr>
+        <w:rPr>
+          <w:rFonts w:eastAsiaTheme="minorEastAsia"/>
+        </w:rPr>
+      </w:pPr>
+    </w:p>
+    <w:p>
+      <w:pPr>
+        <w:rPr>
+          <w:rFonts w:eastAsiaTheme="minorEastAsia"/>
+        </w:rPr>
+      </w:pPr>
+      <w:r>
+        <w:rPr>
+          <w:rFonts w:eastAsiaTheme="minorEastAsia"/>
+        </w:rPr>
+        <w:lastRenderedPageBreak/>
         <w:t xml:space="preserve">Now that </w:t>
       </w:r>
       <w:r>
@@ -1711,71 +2117,6 @@
           <w:rFonts w:eastAsiaTheme="minorEastAsia"/>
         </w:rPr>
       </w:pPr>
-    </w:p>
-    <w:p>
-      <w:pPr>
-        <w:rPr>
-          <w:rFonts w:eastAsiaTheme="minorEastAsia"/>
-        </w:rPr>
-      </w:pPr>
-      <w:r>
-        <w:rPr>
-          <w:rFonts w:eastAsiaTheme="minorEastAsia"/>
-        </w:rPr>
-        <w:t>We need to make sure that the</w:t>
-      </w:r>
-      <w:r>
-        <w:rPr>
-          <w:rFonts w:eastAsiaTheme="minorEastAsia"/>
-        </w:rPr>
-        <w:t xml:space="preserve"> running the temperature at different extremes and/or </w:t>
-      </w:r>
-      <w:r>
-        <w:rPr>
-          <w:rFonts w:eastAsiaTheme="minorEastAsia"/>
-        </w:rPr>
-        <w:t xml:space="preserve"> </w:t>
-      </w:r>
-      <m:oMath>
-        <m:sSub>
-          <m:sSubPr>
-            <m:ctrlPr>
-              <w:rPr>
-                <w:rFonts w:ascii="Cambria Math" w:eastAsiaTheme="minorEastAsia" w:hAnsi="Cambria Math"/>
-              </w:rPr>
-            </m:ctrlPr>
-          </m:sSubPr>
-          <m:e>
-            <m:r>
-              <w:rPr>
-                <w:rFonts w:ascii="Cambria Math" w:eastAsiaTheme="minorEastAsia" w:hAnsi="Cambria Math"/>
-              </w:rPr>
-              <m:t>R</m:t>
-            </m:r>
-          </m:e>
-          <m:sub>
-            <m:r>
-              <w:rPr>
-                <w:rFonts w:ascii="Cambria Math" w:eastAsiaTheme="minorEastAsia" w:hAnsi="Cambria Math"/>
-              </w:rPr>
-              <m:t>j</m:t>
-            </m:r>
-          </m:sub>
-        </m:sSub>
-      </m:oMath>
-      <w:r>
-        <w:rPr>
-          <w:rFonts w:eastAsiaTheme="minorEastAsia"/>
-        </w:rPr>
-        <w:t xml:space="preserve"> elements don’t “break” the system.</w:t>
-      </w:r>
-    </w:p>
-    <w:p>
-      <w:pPr>
-        <w:rPr>
-          <w:rFonts w:eastAsiaTheme="minorEastAsia"/>
-        </w:rPr>
-      </w:pPr>
       <w:r>
         <w:rPr>
           <w:rFonts w:eastAsiaTheme="minorEastAsia"/>
@@ -1802,10 +2143,7 @@
     </w:p>
     <w:p>
       <w:r>
-        <w:t xml:space="preserve">New Additional Doc: John Gazewood at Lee St </w:t>
-      </w:r>
-      <w:r>
-        <w:t>- 434-924-5348</w:t>
+        <w:t>New Additional Doc: John Gazewood at Lee St - 434-924-5348</w:t>
       </w:r>
     </w:p>
     <w:p>

</xml_diff>

<commit_message>
Refactor MLE documentation and enhance fitting parameter resources
- Moved MLE-related documents to a dedicated folder for better organization, including `MLE_basics.md` and `MLE_fit_explainer.md`.
- Added new markdown files detailing the fitting process for parameters such as lambda, gamma, and temperature, enhancing instructional clarity.
- Introduced a PDF document summarizing the MLE fitting process for easier reference.
- Updated existing scripts and JSON files to reflect the latest fitting methodologies and results, ensuring accurate tracking of parameter values.

These changes improve the structure and accessibility of MLE resources, supporting ongoing analysis and understanding of the fitting process.
</commit_message>
<xml_diff>
--- a/3-Master_Plan/Alex_stuff/MLE_prob.docx
+++ b/3-Master_Plan/Alex_stuff/MLE_prob.docx
@@ -2127,7 +2127,13 @@
     <w:p>
       <w:r>
         <w:lastRenderedPageBreak/>
-        <w:t>VA Community Care number – 877-881-7618</w:t>
+        <w:t xml:space="preserve">Richmond </w:t>
+      </w:r>
+      <w:r>
+        <w:t>VA Community Care number – 8</w:t>
+      </w:r>
+      <w:r>
+        <w:t>40-675-5537</w:t>
       </w:r>
     </w:p>
     <w:p/>

</xml_diff>